<commit_message>
minor changes to old files
minor changes to old files
</commit_message>
<xml_diff>
--- a/01_paper/20250522_PAP.docx
+++ b/01_paper/20250522_PAP.docx
@@ -9336,6 +9336,7 @@
           <w:rFonts w:asciiTheme="minorHAnsi" w:eastAsiaTheme="minorEastAsia" w:hAnsiTheme="minorHAnsi" w:cstheme="minorBidi"/>
         </w:rPr>
       </w:pPr>
+      <w:commentRangeStart w:id="3"/>
       <w:r>
         <w:rPr>
           <w:rFonts w:asciiTheme="minorHAnsi" w:eastAsiaTheme="minorEastAsia" w:hAnsiTheme="minorHAnsi" w:cstheme="minorBidi"/>
@@ -9359,6 +9360,14 @@
           <w:rFonts w:asciiTheme="minorHAnsi" w:eastAsiaTheme="minorEastAsia" w:hAnsiTheme="minorHAnsi" w:cstheme="minorBidi"/>
         </w:rPr>
         <w:t>union position</w:t>
+      </w:r>
+      <w:commentRangeEnd w:id="3"/>
+      <w:r>
+        <w:rPr>
+          <w:rStyle w:val="CommentReference"/>
+          <w:rFonts w:asciiTheme="minorHAnsi" w:eastAsiaTheme="minorEastAsia" w:hAnsiTheme="minorHAnsi" w:cstheme="minorBidi"/>
+        </w:rPr>
+        <w:commentReference w:id="3"/>
       </w:r>
     </w:p>
     <w:p>
@@ -11162,7 +11171,7 @@
           <w:rFonts w:asciiTheme="minorHAnsi" w:hAnsiTheme="minorHAnsi"/>
         </w:rPr>
       </w:pPr>
-      <w:commentRangeStart w:id="3"/>
+      <w:commentRangeStart w:id="4"/>
       <w:r>
         <w:rPr>
           <w:rFonts w:asciiTheme="minorHAnsi" w:hAnsiTheme="minorHAnsi"/>
@@ -11171,7 +11180,7 @@
         </w:rPr>
         <w:t>References on unions</w:t>
       </w:r>
-      <w:commentRangeEnd w:id="3"/>
+      <w:commentRangeEnd w:id="4"/>
       <w:r>
         <w:rPr>
           <w:rStyle w:val="CommentReference"/>
@@ -11180,7 +11189,7 @@
           <w:szCs w:val="24"/>
           <w:lang w:eastAsia="ja-JP"/>
         </w:rPr>
-        <w:commentReference w:id="3"/>
+        <w:commentReference w:id="4"/>
       </w:r>
     </w:p>
     <w:p>
@@ -11520,7 +11529,27 @@
       </w:r>
     </w:p>
   </w:comment>
-  <w:comment w:id="3" w:author="Huguenot-Noel, Robin [2]" w:date="2025-05-20T16:43:00Z" w:initials="HNR">
+  <w:comment w:id="3" w:author="Huguenot-Noel, Robin" w:date="2025-05-22T14:37:00Z" w:initials="RH">
+    <w:p>
+      <w:r>
+        <w:rPr>
+          <w:rStyle w:val="CommentReference"/>
+        </w:rPr>
+        <w:annotationRef/>
+      </w:r>
+      <w:r>
+        <w:rPr>
+          <w:rFonts w:asciiTheme="minorHAnsi" w:eastAsiaTheme="minorEastAsia" w:hAnsiTheme="minorHAnsi" w:cstheme="minorBidi"/>
+          <w:color w:val="000000"/>
+          <w:sz w:val="20"/>
+          <w:szCs w:val="20"/>
+          <w:lang w:val="en-US" w:eastAsia="ja-JP"/>
+        </w:rPr>
+        <w:t xml:space="preserve">Il serait quand meme dommage de ne pas regarder l’effet du changement de package ici aussi non? Je me demande a present pourquoi tu indiquais qu’il ne serait plus possible de rester sur le 2*2 et d’enlever l’option “No Union position”. Si jamais j’ai mal compris, cela me convient de revenir a notre 2*2 tel que précédemment concu. Il faudrait alors inverser Factor 1 et Factor 2. </w:t>
+      </w:r>
+    </w:p>
+  </w:comment>
+  <w:comment w:id="4" w:author="Huguenot-Noel, Robin [2]" w:date="2025-05-20T16:43:00Z" w:initials="HNR">
     <w:p>
       <w:r>
         <w:rPr>
@@ -11548,6 +11577,7 @@
   <w15:commentEx w15:paraId="728DA7D7" w15:done="0"/>
   <w15:commentEx w15:paraId="11EF9838" w15:done="0"/>
   <w15:commentEx w15:paraId="68C354E6" w15:done="0"/>
+  <w15:commentEx w15:paraId="6E1AAC9E" w15:done="0"/>
   <w15:commentEx w15:paraId="7EBED338" w15:done="0"/>
 </w15:commentsEx>
 </file>
@@ -11557,6 +11587,7 @@
   <w16cex:commentExtensible w16cex:durableId="0F260B6A" w16cex:dateUtc="2025-05-19T14:00:00Z"/>
   <w16cex:commentExtensible w16cex:durableId="6C9FD273" w16cex:dateUtc="2025-05-19T14:02:00Z"/>
   <w16cex:commentExtensible w16cex:durableId="6A7EC8E7" w16cex:dateUtc="2025-05-22T12:19:00Z"/>
+  <w16cex:commentExtensible w16cex:durableId="5C91DBAB" w16cex:dateUtc="2025-05-22T12:37:00Z"/>
   <w16cex:commentExtensible w16cex:durableId="5D297B68" w16cex:dateUtc="2025-05-20T14:43:00Z"/>
 </w16cex:commentsExtensible>
 </file>
@@ -11566,6 +11597,7 @@
   <w16cid:commentId w16cid:paraId="728DA7D7" w16cid:durableId="0F260B6A"/>
   <w16cid:commentId w16cid:paraId="11EF9838" w16cid:durableId="6C9FD273"/>
   <w16cid:commentId w16cid:paraId="68C354E6" w16cid:durableId="6A7EC8E7"/>
+  <w16cid:commentId w16cid:paraId="6E1AAC9E" w16cid:durableId="5C91DBAB"/>
   <w16cid:commentId w16cid:paraId="7EBED338" w16cid:durableId="5D297B68"/>
 </w16cid:commentsIds>
 </file>

</xml_diff>